<commit_message>
Envanter doğrulaması: Frekans Oranı, etiket kirliliği duyarlılığı, Sentinel-2/GEE hattı
- scripts/15: Kocaman yöntemiyle FR (eğim, faya/kırılmaya uzaklık, yükseklik, arazi
  örtüsü); litoloji FR'si Macrostrat PROXY olarak etiketlendi
- scripts/16: "heyelan yok" etiketinin kirliliğine duyarlılık (tampon 1/2 km, PU-casus,
  Elkan–Noto c); AUC dayanıklı (0.965–0.967), başlangıç eşiği LR=1 0.04–0.09 g sabit,
  P=0.5 Kritik PGA 0.35–0.57 g arasında kayıyor; kaldığı yerden devam eder
- scripts/14 + src/data_engineering/sentinel2.py: 2022→2023 yaz NDVI/parlaklık değişimi
  ile poligon doğrulama; yavaş bağlantı için Google Earth Engine betiği (gee/ndvi_change.js)
  ve --from-gee içe aktarma
- Rapor 5.7 bölümü ve docs/V2_SONUCLAR.md 0.8–0.9 güncellendi
</commit_message>
<xml_diff>
--- a/Heyelan_Dijital_Twin_Rapor.docx
+++ b/Heyelan_Dijital_Twin_Rapor.docx
@@ -5881,6 +5881,2571 @@
     </w:p>
     <w:p>
       <w:pPr>
+        <w:pStyle w:val="Heading2"/>
+      </w:pPr>
+      <w:r>
+        <w:t>5.7 Envanterin ve Etiketlerin Doğrulanması</w:t>
+      </w:r>
+    </w:p>
+    <w:p>
+      <w:r>
+        <w:rPr>
+          <w:b w:val="0"/>
+          <w:i w:val="0"/>
+        </w:rPr>
+        <w:t>Modelin öğrendiği heyelan envanterinin (Kocaman ve ark. 2025) güvenilirliği üç yoldan sınandı.</w:t>
+      </w:r>
+    </w:p>
+    <w:p>
+      <w:r>
+        <w:rPr>
+          <w:b/>
+          <w:i w:val="0"/>
+        </w:rPr>
+        <w:t>Bağımsız yeniden hesaplama.</w:t>
+      </w:r>
+      <w:r>
+        <w:rPr>
+          <w:b w:val="0"/>
+          <w:i w:val="0"/>
+        </w:rPr>
+        <w:t xml:space="preserve"> Makaledeki sayılar kendi verimizle yeniden üretildi: 2.596 poligon, en küçük 21,8 m², en büyük 8,9625 km², toplam alan 42,9 km² (makalede 68.309 piksel × 25 m ≈ 42,7 km²), ortalama eğim 23,4° (makalede 23,0°) ve arazi örtüsü sıralaması (çayır &gt; ağaç &gt; çıplak) birebir tutuyor. Ortalama yükseklik farkı (makalede 1.148 m) piksel ağırlıklandırmasından kaynaklanıyor: tek bir 8,96 km²’lik heyelan toplam alanın %21’i; heyelan başına ortalama 864 m, alan ağırlıklı 1.106 m.</w:t>
+      </w:r>
+    </w:p>
+    <w:p>
+      <w:r>
+        <w:rPr>
+          <w:b/>
+          <w:i w:val="0"/>
+        </w:rPr>
+        <w:t>Frekans Oranı (FR).</w:t>
+      </w:r>
+      <w:r>
+        <w:rPr>
+          <w:b w:val="0"/>
+          <w:i w:val="0"/>
+        </w:rPr>
+        <w:t xml:space="preserve"> Kocaman ve ark. yöntemiyle hesaplandı. Litoloji FR’si yalnızca Macrostrat PROXY’siyle üretilebildiği için makaledeki MTA tabanlı değerlerle (ör. peridotit 6,70) doğrudan karşılaştırılamaz; asıl tablo MTA haritası gelince üretilecek.</w:t>
+      </w:r>
+    </w:p>
+    <w:tbl>
+      <w:tblPr>
+        <w:tblStyle w:val="TableGrid"/>
+        <w:tblW w:type="auto" w:w="0"/>
+        <w:jc w:val="center"/>
+        <w:tblLayout w:type="fixed"/>
+        <w:tblLook w:firstColumn="1" w:firstRow="1" w:lastColumn="0" w:lastRow="0" w:noHBand="0" w:noVBand="1" w:val="04A0"/>
+        <w:tblBorders>
+          <w:top w:val="single" w:sz="4" w:color="C9CED6"/>
+          <w:left w:val="single" w:sz="4" w:color="C9CED6"/>
+          <w:bottom w:val="single" w:sz="4" w:color="C9CED6"/>
+          <w:right w:val="single" w:sz="4" w:color="C9CED6"/>
+          <w:insideH w:val="single" w:sz="4" w:color="C9CED6"/>
+          <w:insideV w:val="single" w:sz="4" w:color="C9CED6"/>
+        </w:tblBorders>
+      </w:tblPr>
+      <w:tblGrid>
+        <w:gridCol w:w="3167"/>
+        <w:gridCol w:w="3167"/>
+        <w:gridCol w:w="3167"/>
+      </w:tblGrid>
+      <w:tr>
+        <w:tc>
+          <w:tcPr>
+            <w:tcW w:type="dxa" w:w="3969"/>
+            <w:shd w:val="clear" w:color="auto" w:fill="1F3864"/>
+            <w:vAlign w:val="center"/>
+          </w:tcPr>
+          <w:p>
+            <w:pPr>
+              <w:spacing w:after="20" w:before="20"/>
+            </w:pPr>
+            <w:r/>
+            <w:r>
+              <w:rPr>
+                <w:b/>
+                <w:color w:val="FFFFFF"/>
+                <w:sz w:val="17"/>
+              </w:rPr>
+              <w:t>Faktör</w:t>
+            </w:r>
+          </w:p>
+        </w:tc>
+        <w:tc>
+          <w:tcPr>
+            <w:tcW w:type="dxa" w:w="2835"/>
+            <w:shd w:val="clear" w:color="auto" w:fill="1F3864"/>
+            <w:vAlign w:val="center"/>
+          </w:tcPr>
+          <w:p>
+            <w:pPr>
+              <w:spacing w:after="20" w:before="20"/>
+            </w:pPr>
+            <w:r/>
+            <w:r>
+              <w:rPr>
+                <w:b/>
+                <w:color w:val="FFFFFF"/>
+                <w:sz w:val="17"/>
+              </w:rPr>
+              <w:t>Sınıf</w:t>
+            </w:r>
+          </w:p>
+        </w:tc>
+        <w:tc>
+          <w:tcPr>
+            <w:tcW w:type="dxa" w:w="1417"/>
+            <w:shd w:val="clear" w:color="auto" w:fill="1F3864"/>
+            <w:vAlign w:val="center"/>
+          </w:tcPr>
+          <w:p>
+            <w:pPr>
+              <w:spacing w:after="20" w:before="20"/>
+              <w:jc w:val="right"/>
+            </w:pPr>
+            <w:r/>
+            <w:r>
+              <w:rPr>
+                <w:b/>
+                <w:color w:val="FFFFFF"/>
+                <w:sz w:val="17"/>
+              </w:rPr>
+              <w:t>FR</w:t>
+            </w:r>
+          </w:p>
+        </w:tc>
+      </w:tr>
+      <w:tr>
+        <w:tc>
+          <w:tcPr>
+            <w:tcW w:type="dxa" w:w="3969"/>
+            <w:vAlign w:val="center"/>
+          </w:tcPr>
+          <w:p>
+            <w:pPr>
+              <w:spacing w:after="20" w:before="20"/>
+            </w:pPr>
+            <w:r>
+              <w:rPr>
+                <w:b w:val="0"/>
+                <w:i w:val="0"/>
+                <w:sz w:val="17"/>
+              </w:rPr>
+              <w:t>eğim (°)</w:t>
+            </w:r>
+          </w:p>
+        </w:tc>
+        <w:tc>
+          <w:tcPr>
+            <w:tcW w:type="dxa" w:w="2835"/>
+            <w:vAlign w:val="center"/>
+          </w:tcPr>
+          <w:p>
+            <w:pPr>
+              <w:spacing w:after="20" w:before="20"/>
+            </w:pPr>
+            <w:r>
+              <w:rPr>
+                <w:b w:val="0"/>
+                <w:i w:val="0"/>
+                <w:sz w:val="17"/>
+              </w:rPr>
+              <w:t>0–5</w:t>
+            </w:r>
+          </w:p>
+        </w:tc>
+        <w:tc>
+          <w:tcPr>
+            <w:tcW w:type="dxa" w:w="1417"/>
+            <w:vAlign w:val="center"/>
+          </w:tcPr>
+          <w:p>
+            <w:pPr>
+              <w:spacing w:after="20" w:before="20"/>
+              <w:jc w:val="right"/>
+            </w:pPr>
+            <w:r>
+              <w:rPr>
+                <w:b w:val="0"/>
+                <w:i w:val="0"/>
+                <w:sz w:val="17"/>
+              </w:rPr>
+              <w:t>0,06</w:t>
+            </w:r>
+          </w:p>
+        </w:tc>
+      </w:tr>
+      <w:tr>
+        <w:tc>
+          <w:tcPr>
+            <w:tcW w:type="dxa" w:w="3969"/>
+            <w:shd w:val="clear" w:color="auto" w:fill="EEF2F8"/>
+            <w:vAlign w:val="center"/>
+          </w:tcPr>
+          <w:p>
+            <w:pPr>
+              <w:spacing w:after="20" w:before="20"/>
+            </w:pPr>
+            <w:r>
+              <w:rPr>
+                <w:b w:val="0"/>
+                <w:i w:val="0"/>
+                <w:sz w:val="17"/>
+              </w:rPr>
+              <w:t>eğim (°)</w:t>
+            </w:r>
+          </w:p>
+        </w:tc>
+        <w:tc>
+          <w:tcPr>
+            <w:tcW w:type="dxa" w:w="2835"/>
+            <w:shd w:val="clear" w:color="auto" w:fill="EEF2F8"/>
+            <w:vAlign w:val="center"/>
+          </w:tcPr>
+          <w:p>
+            <w:pPr>
+              <w:spacing w:after="20" w:before="20"/>
+            </w:pPr>
+            <w:r>
+              <w:rPr>
+                <w:b w:val="0"/>
+                <w:i w:val="0"/>
+                <w:sz w:val="17"/>
+              </w:rPr>
+              <w:t>5–10</w:t>
+            </w:r>
+          </w:p>
+        </w:tc>
+        <w:tc>
+          <w:tcPr>
+            <w:tcW w:type="dxa" w:w="1417"/>
+            <w:shd w:val="clear" w:color="auto" w:fill="EEF2F8"/>
+            <w:vAlign w:val="center"/>
+          </w:tcPr>
+          <w:p>
+            <w:pPr>
+              <w:spacing w:after="20" w:before="20"/>
+              <w:jc w:val="right"/>
+            </w:pPr>
+            <w:r>
+              <w:rPr>
+                <w:b w:val="0"/>
+                <w:i w:val="0"/>
+                <w:sz w:val="17"/>
+              </w:rPr>
+              <w:t>0,51</w:t>
+            </w:r>
+          </w:p>
+        </w:tc>
+      </w:tr>
+      <w:tr>
+        <w:tc>
+          <w:tcPr>
+            <w:tcW w:type="dxa" w:w="3969"/>
+            <w:vAlign w:val="center"/>
+          </w:tcPr>
+          <w:p>
+            <w:pPr>
+              <w:spacing w:after="20" w:before="20"/>
+            </w:pPr>
+            <w:r>
+              <w:rPr>
+                <w:b w:val="0"/>
+                <w:i w:val="0"/>
+                <w:sz w:val="17"/>
+              </w:rPr>
+              <w:t>eğim (°)</w:t>
+            </w:r>
+          </w:p>
+        </w:tc>
+        <w:tc>
+          <w:tcPr>
+            <w:tcW w:type="dxa" w:w="2835"/>
+            <w:vAlign w:val="center"/>
+          </w:tcPr>
+          <w:p>
+            <w:pPr>
+              <w:spacing w:after="20" w:before="20"/>
+            </w:pPr>
+            <w:r>
+              <w:rPr>
+                <w:b w:val="0"/>
+                <w:i w:val="0"/>
+                <w:sz w:val="17"/>
+              </w:rPr>
+              <w:t>10–15</w:t>
+            </w:r>
+          </w:p>
+        </w:tc>
+        <w:tc>
+          <w:tcPr>
+            <w:tcW w:type="dxa" w:w="1417"/>
+            <w:vAlign w:val="center"/>
+          </w:tcPr>
+          <w:p>
+            <w:pPr>
+              <w:spacing w:after="20" w:before="20"/>
+              <w:jc w:val="right"/>
+            </w:pPr>
+            <w:r>
+              <w:rPr>
+                <w:b w:val="0"/>
+                <w:i w:val="0"/>
+                <w:sz w:val="17"/>
+              </w:rPr>
+              <w:t>1,37</w:t>
+            </w:r>
+          </w:p>
+        </w:tc>
+      </w:tr>
+      <w:tr>
+        <w:tc>
+          <w:tcPr>
+            <w:tcW w:type="dxa" w:w="3969"/>
+            <w:shd w:val="clear" w:color="auto" w:fill="EEF2F8"/>
+            <w:vAlign w:val="center"/>
+          </w:tcPr>
+          <w:p>
+            <w:pPr>
+              <w:spacing w:after="20" w:before="20"/>
+            </w:pPr>
+            <w:r>
+              <w:rPr>
+                <w:b w:val="0"/>
+                <w:i w:val="0"/>
+                <w:sz w:val="17"/>
+              </w:rPr>
+              <w:t>eğim (°)</w:t>
+            </w:r>
+          </w:p>
+        </w:tc>
+        <w:tc>
+          <w:tcPr>
+            <w:tcW w:type="dxa" w:w="2835"/>
+            <w:shd w:val="clear" w:color="auto" w:fill="EEF2F8"/>
+            <w:vAlign w:val="center"/>
+          </w:tcPr>
+          <w:p>
+            <w:pPr>
+              <w:spacing w:after="20" w:before="20"/>
+            </w:pPr>
+            <w:r>
+              <w:rPr>
+                <w:b w:val="0"/>
+                <w:i w:val="0"/>
+                <w:sz w:val="17"/>
+              </w:rPr>
+              <w:t>15–20</w:t>
+            </w:r>
+          </w:p>
+        </w:tc>
+        <w:tc>
+          <w:tcPr>
+            <w:tcW w:type="dxa" w:w="1417"/>
+            <w:shd w:val="clear" w:color="auto" w:fill="EEF2F8"/>
+            <w:vAlign w:val="center"/>
+          </w:tcPr>
+          <w:p>
+            <w:pPr>
+              <w:spacing w:after="20" w:before="20"/>
+              <w:jc w:val="right"/>
+            </w:pPr>
+            <w:r>
+              <w:rPr>
+                <w:b w:val="0"/>
+                <w:i w:val="0"/>
+                <w:sz w:val="17"/>
+              </w:rPr>
+              <w:t>2,16</w:t>
+            </w:r>
+          </w:p>
+        </w:tc>
+      </w:tr>
+      <w:tr>
+        <w:tc>
+          <w:tcPr>
+            <w:tcW w:type="dxa" w:w="3969"/>
+            <w:vAlign w:val="center"/>
+          </w:tcPr>
+          <w:p>
+            <w:pPr>
+              <w:spacing w:after="20" w:before="20"/>
+            </w:pPr>
+            <w:r>
+              <w:rPr>
+                <w:b w:val="0"/>
+                <w:i w:val="0"/>
+                <w:sz w:val="17"/>
+              </w:rPr>
+              <w:t>eğim (°)</w:t>
+            </w:r>
+          </w:p>
+        </w:tc>
+        <w:tc>
+          <w:tcPr>
+            <w:tcW w:type="dxa" w:w="2835"/>
+            <w:vAlign w:val="center"/>
+          </w:tcPr>
+          <w:p>
+            <w:pPr>
+              <w:spacing w:after="20" w:before="20"/>
+            </w:pPr>
+            <w:r>
+              <w:rPr>
+                <w:b w:val="0"/>
+                <w:i w:val="0"/>
+                <w:sz w:val="17"/>
+              </w:rPr>
+              <w:t>20–25</w:t>
+            </w:r>
+          </w:p>
+        </w:tc>
+        <w:tc>
+          <w:tcPr>
+            <w:tcW w:type="dxa" w:w="1417"/>
+            <w:vAlign w:val="center"/>
+          </w:tcPr>
+          <w:p>
+            <w:pPr>
+              <w:spacing w:after="20" w:before="20"/>
+              <w:jc w:val="right"/>
+            </w:pPr>
+            <w:r>
+              <w:rPr>
+                <w:b w:val="0"/>
+                <w:i w:val="0"/>
+                <w:sz w:val="17"/>
+              </w:rPr>
+              <w:t>2,97</w:t>
+            </w:r>
+          </w:p>
+        </w:tc>
+      </w:tr>
+      <w:tr>
+        <w:tc>
+          <w:tcPr>
+            <w:tcW w:type="dxa" w:w="3969"/>
+            <w:shd w:val="clear" w:color="auto" w:fill="EEF2F8"/>
+            <w:vAlign w:val="center"/>
+          </w:tcPr>
+          <w:p>
+            <w:pPr>
+              <w:spacing w:after="20" w:before="20"/>
+            </w:pPr>
+            <w:r>
+              <w:rPr>
+                <w:b w:val="0"/>
+                <w:i w:val="0"/>
+                <w:sz w:val="17"/>
+              </w:rPr>
+              <w:t>eğim (°)</w:t>
+            </w:r>
+          </w:p>
+        </w:tc>
+        <w:tc>
+          <w:tcPr>
+            <w:tcW w:type="dxa" w:w="2835"/>
+            <w:shd w:val="clear" w:color="auto" w:fill="EEF2F8"/>
+            <w:vAlign w:val="center"/>
+          </w:tcPr>
+          <w:p>
+            <w:pPr>
+              <w:spacing w:after="20" w:before="20"/>
+            </w:pPr>
+            <w:r>
+              <w:rPr>
+                <w:b w:val="0"/>
+                <w:i w:val="0"/>
+                <w:sz w:val="17"/>
+              </w:rPr>
+              <w:t>25–30</w:t>
+            </w:r>
+          </w:p>
+        </w:tc>
+        <w:tc>
+          <w:tcPr>
+            <w:tcW w:type="dxa" w:w="1417"/>
+            <w:shd w:val="clear" w:color="auto" w:fill="EEF2F8"/>
+            <w:vAlign w:val="center"/>
+          </w:tcPr>
+          <w:p>
+            <w:pPr>
+              <w:spacing w:after="20" w:before="20"/>
+              <w:jc w:val="right"/>
+            </w:pPr>
+            <w:r>
+              <w:rPr>
+                <w:b w:val="0"/>
+                <w:i w:val="0"/>
+                <w:sz w:val="17"/>
+              </w:rPr>
+              <w:t>4,42</w:t>
+            </w:r>
+          </w:p>
+        </w:tc>
+      </w:tr>
+      <w:tr>
+        <w:tc>
+          <w:tcPr>
+            <w:tcW w:type="dxa" w:w="3969"/>
+            <w:vAlign w:val="center"/>
+          </w:tcPr>
+          <w:p>
+            <w:pPr>
+              <w:spacing w:after="20" w:before="20"/>
+            </w:pPr>
+            <w:r>
+              <w:rPr>
+                <w:b w:val="0"/>
+                <w:i w:val="0"/>
+                <w:sz w:val="17"/>
+              </w:rPr>
+              <w:t>eğim (°)</w:t>
+            </w:r>
+          </w:p>
+        </w:tc>
+        <w:tc>
+          <w:tcPr>
+            <w:tcW w:type="dxa" w:w="2835"/>
+            <w:vAlign w:val="center"/>
+          </w:tcPr>
+          <w:p>
+            <w:pPr>
+              <w:spacing w:after="20" w:before="20"/>
+            </w:pPr>
+            <w:r>
+              <w:rPr>
+                <w:b w:val="0"/>
+                <w:i w:val="0"/>
+                <w:sz w:val="17"/>
+              </w:rPr>
+              <w:t>30–35</w:t>
+            </w:r>
+          </w:p>
+        </w:tc>
+        <w:tc>
+          <w:tcPr>
+            <w:tcW w:type="dxa" w:w="1417"/>
+            <w:vAlign w:val="center"/>
+          </w:tcPr>
+          <w:p>
+            <w:pPr>
+              <w:spacing w:after="20" w:before="20"/>
+              <w:jc w:val="right"/>
+            </w:pPr>
+            <w:r>
+              <w:rPr>
+                <w:b w:val="0"/>
+                <w:i w:val="0"/>
+                <w:sz w:val="17"/>
+              </w:rPr>
+              <w:t>9,07</w:t>
+            </w:r>
+          </w:p>
+        </w:tc>
+      </w:tr>
+      <w:tr>
+        <w:tc>
+          <w:tcPr>
+            <w:tcW w:type="dxa" w:w="3969"/>
+            <w:shd w:val="clear" w:color="auto" w:fill="EEF2F8"/>
+            <w:vAlign w:val="center"/>
+          </w:tcPr>
+          <w:p>
+            <w:pPr>
+              <w:spacing w:after="20" w:before="20"/>
+            </w:pPr>
+            <w:r>
+              <w:rPr>
+                <w:b w:val="0"/>
+                <w:i w:val="0"/>
+                <w:sz w:val="17"/>
+              </w:rPr>
+              <w:t>eğim (°)</w:t>
+            </w:r>
+          </w:p>
+        </w:tc>
+        <w:tc>
+          <w:tcPr>
+            <w:tcW w:type="dxa" w:w="2835"/>
+            <w:shd w:val="clear" w:color="auto" w:fill="EEF2F8"/>
+            <w:vAlign w:val="center"/>
+          </w:tcPr>
+          <w:p>
+            <w:pPr>
+              <w:spacing w:after="20" w:before="20"/>
+            </w:pPr>
+            <w:r>
+              <w:rPr>
+                <w:b w:val="0"/>
+                <w:i w:val="0"/>
+                <w:sz w:val="17"/>
+              </w:rPr>
+              <w:t>35–40</w:t>
+            </w:r>
+          </w:p>
+        </w:tc>
+        <w:tc>
+          <w:tcPr>
+            <w:tcW w:type="dxa" w:w="1417"/>
+            <w:shd w:val="clear" w:color="auto" w:fill="EEF2F8"/>
+            <w:vAlign w:val="center"/>
+          </w:tcPr>
+          <w:p>
+            <w:pPr>
+              <w:spacing w:after="20" w:before="20"/>
+              <w:jc w:val="right"/>
+            </w:pPr>
+            <w:r>
+              <w:rPr>
+                <w:b w:val="0"/>
+                <w:i w:val="0"/>
+                <w:sz w:val="17"/>
+              </w:rPr>
+              <w:t>20,20</w:t>
+            </w:r>
+          </w:p>
+        </w:tc>
+      </w:tr>
+      <w:tr>
+        <w:tc>
+          <w:tcPr>
+            <w:tcW w:type="dxa" w:w="3969"/>
+            <w:vAlign w:val="center"/>
+          </w:tcPr>
+          <w:p>
+            <w:pPr>
+              <w:spacing w:after="20" w:before="20"/>
+            </w:pPr>
+            <w:r>
+              <w:rPr>
+                <w:b w:val="0"/>
+                <w:i w:val="0"/>
+                <w:sz w:val="17"/>
+              </w:rPr>
+              <w:t>eğim (°)</w:t>
+            </w:r>
+          </w:p>
+        </w:tc>
+        <w:tc>
+          <w:tcPr>
+            <w:tcW w:type="dxa" w:w="2835"/>
+            <w:vAlign w:val="center"/>
+          </w:tcPr>
+          <w:p>
+            <w:pPr>
+              <w:spacing w:after="20" w:before="20"/>
+            </w:pPr>
+            <w:r>
+              <w:rPr>
+                <w:b w:val="0"/>
+                <w:i w:val="0"/>
+                <w:sz w:val="17"/>
+              </w:rPr>
+              <w:t>40–90</w:t>
+            </w:r>
+          </w:p>
+        </w:tc>
+        <w:tc>
+          <w:tcPr>
+            <w:tcW w:type="dxa" w:w="1417"/>
+            <w:vAlign w:val="center"/>
+          </w:tcPr>
+          <w:p>
+            <w:pPr>
+              <w:spacing w:after="20" w:before="20"/>
+              <w:jc w:val="right"/>
+            </w:pPr>
+            <w:r>
+              <w:rPr>
+                <w:b w:val="0"/>
+                <w:i w:val="0"/>
+                <w:sz w:val="17"/>
+              </w:rPr>
+              <w:t>35,90</w:t>
+            </w:r>
+          </w:p>
+        </w:tc>
+      </w:tr>
+      <w:tr>
+        <w:tc>
+          <w:tcPr>
+            <w:tcW w:type="dxa" w:w="3969"/>
+            <w:shd w:val="clear" w:color="auto" w:fill="EEF2F8"/>
+            <w:vAlign w:val="center"/>
+          </w:tcPr>
+          <w:p>
+            <w:pPr>
+              <w:spacing w:after="20" w:before="20"/>
+            </w:pPr>
+            <w:r>
+              <w:rPr>
+                <w:b w:val="0"/>
+                <w:i w:val="0"/>
+                <w:sz w:val="17"/>
+              </w:rPr>
+              <w:t>faya uzaklık (km, GEM)</w:t>
+            </w:r>
+          </w:p>
+        </w:tc>
+        <w:tc>
+          <w:tcPr>
+            <w:tcW w:type="dxa" w:w="2835"/>
+            <w:shd w:val="clear" w:color="auto" w:fill="EEF2F8"/>
+            <w:vAlign w:val="center"/>
+          </w:tcPr>
+          <w:p>
+            <w:pPr>
+              <w:spacing w:after="20" w:before="20"/>
+            </w:pPr>
+            <w:r>
+              <w:rPr>
+                <w:b w:val="0"/>
+                <w:i w:val="0"/>
+                <w:sz w:val="17"/>
+              </w:rPr>
+              <w:t>0–2</w:t>
+            </w:r>
+          </w:p>
+        </w:tc>
+        <w:tc>
+          <w:tcPr>
+            <w:tcW w:type="dxa" w:w="1417"/>
+            <w:shd w:val="clear" w:color="auto" w:fill="EEF2F8"/>
+            <w:vAlign w:val="center"/>
+          </w:tcPr>
+          <w:p>
+            <w:pPr>
+              <w:spacing w:after="20" w:before="20"/>
+              <w:jc w:val="right"/>
+            </w:pPr>
+            <w:r>
+              <w:rPr>
+                <w:b w:val="0"/>
+                <w:i w:val="0"/>
+                <w:sz w:val="17"/>
+              </w:rPr>
+              <w:t>3,49</w:t>
+            </w:r>
+          </w:p>
+        </w:tc>
+      </w:tr>
+      <w:tr>
+        <w:tc>
+          <w:tcPr>
+            <w:tcW w:type="dxa" w:w="3969"/>
+            <w:vAlign w:val="center"/>
+          </w:tcPr>
+          <w:p>
+            <w:pPr>
+              <w:spacing w:after="20" w:before="20"/>
+            </w:pPr>
+            <w:r>
+              <w:rPr>
+                <w:b w:val="0"/>
+                <w:i w:val="0"/>
+                <w:sz w:val="17"/>
+              </w:rPr>
+              <w:t>faya uzaklık (km, GEM)</w:t>
+            </w:r>
+          </w:p>
+        </w:tc>
+        <w:tc>
+          <w:tcPr>
+            <w:tcW w:type="dxa" w:w="2835"/>
+            <w:vAlign w:val="center"/>
+          </w:tcPr>
+          <w:p>
+            <w:pPr>
+              <w:spacing w:after="20" w:before="20"/>
+            </w:pPr>
+            <w:r>
+              <w:rPr>
+                <w:b w:val="0"/>
+                <w:i w:val="0"/>
+                <w:sz w:val="17"/>
+              </w:rPr>
+              <w:t>2–5</w:t>
+            </w:r>
+          </w:p>
+        </w:tc>
+        <w:tc>
+          <w:tcPr>
+            <w:tcW w:type="dxa" w:w="1417"/>
+            <w:vAlign w:val="center"/>
+          </w:tcPr>
+          <w:p>
+            <w:pPr>
+              <w:spacing w:after="20" w:before="20"/>
+              <w:jc w:val="right"/>
+            </w:pPr>
+            <w:r>
+              <w:rPr>
+                <w:b w:val="0"/>
+                <w:i w:val="0"/>
+                <w:sz w:val="17"/>
+              </w:rPr>
+              <w:t>2,31</w:t>
+            </w:r>
+          </w:p>
+        </w:tc>
+      </w:tr>
+      <w:tr>
+        <w:tc>
+          <w:tcPr>
+            <w:tcW w:type="dxa" w:w="3969"/>
+            <w:shd w:val="clear" w:color="auto" w:fill="EEF2F8"/>
+            <w:vAlign w:val="center"/>
+          </w:tcPr>
+          <w:p>
+            <w:pPr>
+              <w:spacing w:after="20" w:before="20"/>
+            </w:pPr>
+            <w:r>
+              <w:rPr>
+                <w:b w:val="0"/>
+                <w:i w:val="0"/>
+                <w:sz w:val="17"/>
+              </w:rPr>
+              <w:t>faya uzaklık (km, GEM)</w:t>
+            </w:r>
+          </w:p>
+        </w:tc>
+        <w:tc>
+          <w:tcPr>
+            <w:tcW w:type="dxa" w:w="2835"/>
+            <w:shd w:val="clear" w:color="auto" w:fill="EEF2F8"/>
+            <w:vAlign w:val="center"/>
+          </w:tcPr>
+          <w:p>
+            <w:pPr>
+              <w:spacing w:after="20" w:before="20"/>
+            </w:pPr>
+            <w:r>
+              <w:rPr>
+                <w:b w:val="0"/>
+                <w:i w:val="0"/>
+                <w:sz w:val="17"/>
+              </w:rPr>
+              <w:t>5–10</w:t>
+            </w:r>
+          </w:p>
+        </w:tc>
+        <w:tc>
+          <w:tcPr>
+            <w:tcW w:type="dxa" w:w="1417"/>
+            <w:shd w:val="clear" w:color="auto" w:fill="EEF2F8"/>
+            <w:vAlign w:val="center"/>
+          </w:tcPr>
+          <w:p>
+            <w:pPr>
+              <w:spacing w:after="20" w:before="20"/>
+              <w:jc w:val="right"/>
+            </w:pPr>
+            <w:r>
+              <w:rPr>
+                <w:b w:val="0"/>
+                <w:i w:val="0"/>
+                <w:sz w:val="17"/>
+              </w:rPr>
+              <w:t>1,11</w:t>
+            </w:r>
+          </w:p>
+        </w:tc>
+      </w:tr>
+      <w:tr>
+        <w:tc>
+          <w:tcPr>
+            <w:tcW w:type="dxa" w:w="3969"/>
+            <w:vAlign w:val="center"/>
+          </w:tcPr>
+          <w:p>
+            <w:pPr>
+              <w:spacing w:after="20" w:before="20"/>
+            </w:pPr>
+            <w:r>
+              <w:rPr>
+                <w:b w:val="0"/>
+                <w:i w:val="0"/>
+                <w:sz w:val="17"/>
+              </w:rPr>
+              <w:t>faya uzaklık (km, GEM)</w:t>
+            </w:r>
+          </w:p>
+        </w:tc>
+        <w:tc>
+          <w:tcPr>
+            <w:tcW w:type="dxa" w:w="2835"/>
+            <w:vAlign w:val="center"/>
+          </w:tcPr>
+          <w:p>
+            <w:pPr>
+              <w:spacing w:after="20" w:before="20"/>
+            </w:pPr>
+            <w:r>
+              <w:rPr>
+                <w:b w:val="0"/>
+                <w:i w:val="0"/>
+                <w:sz w:val="17"/>
+              </w:rPr>
+              <w:t>10–20</w:t>
+            </w:r>
+          </w:p>
+        </w:tc>
+        <w:tc>
+          <w:tcPr>
+            <w:tcW w:type="dxa" w:w="1417"/>
+            <w:vAlign w:val="center"/>
+          </w:tcPr>
+          <w:p>
+            <w:pPr>
+              <w:spacing w:after="20" w:before="20"/>
+              <w:jc w:val="right"/>
+            </w:pPr>
+            <w:r>
+              <w:rPr>
+                <w:b w:val="0"/>
+                <w:i w:val="0"/>
+                <w:sz w:val="17"/>
+              </w:rPr>
+              <w:t>1,58</w:t>
+            </w:r>
+          </w:p>
+        </w:tc>
+      </w:tr>
+      <w:tr>
+        <w:tc>
+          <w:tcPr>
+            <w:tcW w:type="dxa" w:w="3969"/>
+            <w:shd w:val="clear" w:color="auto" w:fill="EEF2F8"/>
+            <w:vAlign w:val="center"/>
+          </w:tcPr>
+          <w:p>
+            <w:pPr>
+              <w:spacing w:after="20" w:before="20"/>
+            </w:pPr>
+            <w:r>
+              <w:rPr>
+                <w:b w:val="0"/>
+                <w:i w:val="0"/>
+                <w:sz w:val="17"/>
+              </w:rPr>
+              <w:t>faya uzaklık (km, GEM)</w:t>
+            </w:r>
+          </w:p>
+        </w:tc>
+        <w:tc>
+          <w:tcPr>
+            <w:tcW w:type="dxa" w:w="2835"/>
+            <w:shd w:val="clear" w:color="auto" w:fill="EEF2F8"/>
+            <w:vAlign w:val="center"/>
+          </w:tcPr>
+          <w:p>
+            <w:pPr>
+              <w:spacing w:after="20" w:before="20"/>
+            </w:pPr>
+            <w:r>
+              <w:rPr>
+                <w:b w:val="0"/>
+                <w:i w:val="0"/>
+                <w:sz w:val="17"/>
+              </w:rPr>
+              <w:t>20–40</w:t>
+            </w:r>
+          </w:p>
+        </w:tc>
+        <w:tc>
+          <w:tcPr>
+            <w:tcW w:type="dxa" w:w="1417"/>
+            <w:shd w:val="clear" w:color="auto" w:fill="EEF2F8"/>
+            <w:vAlign w:val="center"/>
+          </w:tcPr>
+          <w:p>
+            <w:pPr>
+              <w:spacing w:after="20" w:before="20"/>
+              <w:jc w:val="right"/>
+            </w:pPr>
+            <w:r>
+              <w:rPr>
+                <w:b w:val="0"/>
+                <w:i w:val="0"/>
+                <w:sz w:val="17"/>
+              </w:rPr>
+              <w:t>0,63</w:t>
+            </w:r>
+          </w:p>
+        </w:tc>
+      </w:tr>
+      <w:tr>
+        <w:tc>
+          <w:tcPr>
+            <w:tcW w:type="dxa" w:w="3969"/>
+            <w:vAlign w:val="center"/>
+          </w:tcPr>
+          <w:p>
+            <w:pPr>
+              <w:spacing w:after="20" w:before="20"/>
+            </w:pPr>
+            <w:r>
+              <w:rPr>
+                <w:b w:val="0"/>
+                <w:i w:val="0"/>
+                <w:sz w:val="17"/>
+              </w:rPr>
+              <w:t>faya uzaklık (km, GEM)</w:t>
+            </w:r>
+          </w:p>
+        </w:tc>
+        <w:tc>
+          <w:tcPr>
+            <w:tcW w:type="dxa" w:w="2835"/>
+            <w:vAlign w:val="center"/>
+          </w:tcPr>
+          <w:p>
+            <w:pPr>
+              <w:spacing w:after="20" w:before="20"/>
+            </w:pPr>
+            <w:r>
+              <w:rPr>
+                <w:b w:val="0"/>
+                <w:i w:val="0"/>
+                <w:sz w:val="17"/>
+              </w:rPr>
+              <w:t>40–300</w:t>
+            </w:r>
+          </w:p>
+        </w:tc>
+        <w:tc>
+          <w:tcPr>
+            <w:tcW w:type="dxa" w:w="1417"/>
+            <w:vAlign w:val="center"/>
+          </w:tcPr>
+          <w:p>
+            <w:pPr>
+              <w:spacing w:after="20" w:before="20"/>
+              <w:jc w:val="right"/>
+            </w:pPr>
+            <w:r>
+              <w:rPr>
+                <w:b w:val="0"/>
+                <w:i w:val="0"/>
+                <w:sz w:val="17"/>
+              </w:rPr>
+              <w:t>0,02</w:t>
+            </w:r>
+          </w:p>
+        </w:tc>
+      </w:tr>
+      <w:tr>
+        <w:tc>
+          <w:tcPr>
+            <w:tcW w:type="dxa" w:w="3969"/>
+            <w:shd w:val="clear" w:color="auto" w:fill="EEF2F8"/>
+            <w:vAlign w:val="center"/>
+          </w:tcPr>
+          <w:p>
+            <w:pPr>
+              <w:spacing w:after="20" w:before="20"/>
+            </w:pPr>
+            <w:r>
+              <w:rPr>
+                <w:b w:val="0"/>
+                <w:i w:val="0"/>
+                <w:sz w:val="17"/>
+              </w:rPr>
+              <w:t>2023 kırılmasına uzaklık (km)</w:t>
+            </w:r>
+          </w:p>
+        </w:tc>
+        <w:tc>
+          <w:tcPr>
+            <w:tcW w:type="dxa" w:w="2835"/>
+            <w:shd w:val="clear" w:color="auto" w:fill="EEF2F8"/>
+            <w:vAlign w:val="center"/>
+          </w:tcPr>
+          <w:p>
+            <w:pPr>
+              <w:spacing w:after="20" w:before="20"/>
+            </w:pPr>
+            <w:r>
+              <w:rPr>
+                <w:b w:val="0"/>
+                <w:i w:val="0"/>
+                <w:sz w:val="17"/>
+              </w:rPr>
+              <w:t>0–2</w:t>
+            </w:r>
+          </w:p>
+        </w:tc>
+        <w:tc>
+          <w:tcPr>
+            <w:tcW w:type="dxa" w:w="1417"/>
+            <w:shd w:val="clear" w:color="auto" w:fill="EEF2F8"/>
+            <w:vAlign w:val="center"/>
+          </w:tcPr>
+          <w:p>
+            <w:pPr>
+              <w:spacing w:after="20" w:before="20"/>
+              <w:jc w:val="right"/>
+            </w:pPr>
+            <w:r>
+              <w:rPr>
+                <w:b w:val="0"/>
+                <w:i w:val="0"/>
+                <w:sz w:val="17"/>
+              </w:rPr>
+              <w:t>6,32</w:t>
+            </w:r>
+          </w:p>
+        </w:tc>
+      </w:tr>
+      <w:tr>
+        <w:tc>
+          <w:tcPr>
+            <w:tcW w:type="dxa" w:w="3969"/>
+            <w:vAlign w:val="center"/>
+          </w:tcPr>
+          <w:p>
+            <w:pPr>
+              <w:spacing w:after="20" w:before="20"/>
+            </w:pPr>
+            <w:r>
+              <w:rPr>
+                <w:b w:val="0"/>
+                <w:i w:val="0"/>
+                <w:sz w:val="17"/>
+              </w:rPr>
+              <w:t>2023 kırılmasına uzaklık (km)</w:t>
+            </w:r>
+          </w:p>
+        </w:tc>
+        <w:tc>
+          <w:tcPr>
+            <w:tcW w:type="dxa" w:w="2835"/>
+            <w:vAlign w:val="center"/>
+          </w:tcPr>
+          <w:p>
+            <w:pPr>
+              <w:spacing w:after="20" w:before="20"/>
+            </w:pPr>
+            <w:r>
+              <w:rPr>
+                <w:b w:val="0"/>
+                <w:i w:val="0"/>
+                <w:sz w:val="17"/>
+              </w:rPr>
+              <w:t>2–5</w:t>
+            </w:r>
+          </w:p>
+        </w:tc>
+        <w:tc>
+          <w:tcPr>
+            <w:tcW w:type="dxa" w:w="1417"/>
+            <w:vAlign w:val="center"/>
+          </w:tcPr>
+          <w:p>
+            <w:pPr>
+              <w:spacing w:after="20" w:before="20"/>
+              <w:jc w:val="right"/>
+            </w:pPr>
+            <w:r>
+              <w:rPr>
+                <w:b w:val="0"/>
+                <w:i w:val="0"/>
+                <w:sz w:val="17"/>
+              </w:rPr>
+              <w:t>5,12</w:t>
+            </w:r>
+          </w:p>
+        </w:tc>
+      </w:tr>
+      <w:tr>
+        <w:tc>
+          <w:tcPr>
+            <w:tcW w:type="dxa" w:w="3969"/>
+            <w:shd w:val="clear" w:color="auto" w:fill="EEF2F8"/>
+            <w:vAlign w:val="center"/>
+          </w:tcPr>
+          <w:p>
+            <w:pPr>
+              <w:spacing w:after="20" w:before="20"/>
+            </w:pPr>
+            <w:r>
+              <w:rPr>
+                <w:b w:val="0"/>
+                <w:i w:val="0"/>
+                <w:sz w:val="17"/>
+              </w:rPr>
+              <w:t>2023 kırılmasına uzaklık (km)</w:t>
+            </w:r>
+          </w:p>
+        </w:tc>
+        <w:tc>
+          <w:tcPr>
+            <w:tcW w:type="dxa" w:w="2835"/>
+            <w:shd w:val="clear" w:color="auto" w:fill="EEF2F8"/>
+            <w:vAlign w:val="center"/>
+          </w:tcPr>
+          <w:p>
+            <w:pPr>
+              <w:spacing w:after="20" w:before="20"/>
+            </w:pPr>
+            <w:r>
+              <w:rPr>
+                <w:b w:val="0"/>
+                <w:i w:val="0"/>
+                <w:sz w:val="17"/>
+              </w:rPr>
+              <w:t>5–10</w:t>
+            </w:r>
+          </w:p>
+        </w:tc>
+        <w:tc>
+          <w:tcPr>
+            <w:tcW w:type="dxa" w:w="1417"/>
+            <w:shd w:val="clear" w:color="auto" w:fill="EEF2F8"/>
+            <w:vAlign w:val="center"/>
+          </w:tcPr>
+          <w:p>
+            <w:pPr>
+              <w:spacing w:after="20" w:before="20"/>
+              <w:jc w:val="right"/>
+            </w:pPr>
+            <w:r>
+              <w:rPr>
+                <w:b w:val="0"/>
+                <w:i w:val="0"/>
+                <w:sz w:val="17"/>
+              </w:rPr>
+              <w:t>3,46</w:t>
+            </w:r>
+          </w:p>
+        </w:tc>
+      </w:tr>
+      <w:tr>
+        <w:tc>
+          <w:tcPr>
+            <w:tcW w:type="dxa" w:w="3969"/>
+            <w:vAlign w:val="center"/>
+          </w:tcPr>
+          <w:p>
+            <w:pPr>
+              <w:spacing w:after="20" w:before="20"/>
+            </w:pPr>
+            <w:r>
+              <w:rPr>
+                <w:b w:val="0"/>
+                <w:i w:val="0"/>
+                <w:sz w:val="17"/>
+              </w:rPr>
+              <w:t>2023 kırılmasına uzaklık (km)</w:t>
+            </w:r>
+          </w:p>
+        </w:tc>
+        <w:tc>
+          <w:tcPr>
+            <w:tcW w:type="dxa" w:w="2835"/>
+            <w:vAlign w:val="center"/>
+          </w:tcPr>
+          <w:p>
+            <w:pPr>
+              <w:spacing w:after="20" w:before="20"/>
+            </w:pPr>
+            <w:r>
+              <w:rPr>
+                <w:b w:val="0"/>
+                <w:i w:val="0"/>
+                <w:sz w:val="17"/>
+              </w:rPr>
+              <w:t>10–20</w:t>
+            </w:r>
+          </w:p>
+        </w:tc>
+        <w:tc>
+          <w:tcPr>
+            <w:tcW w:type="dxa" w:w="1417"/>
+            <w:vAlign w:val="center"/>
+          </w:tcPr>
+          <w:p>
+            <w:pPr>
+              <w:spacing w:after="20" w:before="20"/>
+              <w:jc w:val="right"/>
+            </w:pPr>
+            <w:r>
+              <w:rPr>
+                <w:b w:val="0"/>
+                <w:i w:val="0"/>
+                <w:sz w:val="17"/>
+              </w:rPr>
+              <w:t>2,22</w:t>
+            </w:r>
+          </w:p>
+        </w:tc>
+      </w:tr>
+      <w:tr>
+        <w:tc>
+          <w:tcPr>
+            <w:tcW w:type="dxa" w:w="3969"/>
+            <w:shd w:val="clear" w:color="auto" w:fill="EEF2F8"/>
+            <w:vAlign w:val="center"/>
+          </w:tcPr>
+          <w:p>
+            <w:pPr>
+              <w:spacing w:after="20" w:before="20"/>
+            </w:pPr>
+            <w:r>
+              <w:rPr>
+                <w:b w:val="0"/>
+                <w:i w:val="0"/>
+                <w:sz w:val="17"/>
+              </w:rPr>
+              <w:t>2023 kırılmasına uzaklık (km)</w:t>
+            </w:r>
+          </w:p>
+        </w:tc>
+        <w:tc>
+          <w:tcPr>
+            <w:tcW w:type="dxa" w:w="2835"/>
+            <w:shd w:val="clear" w:color="auto" w:fill="EEF2F8"/>
+            <w:vAlign w:val="center"/>
+          </w:tcPr>
+          <w:p>
+            <w:pPr>
+              <w:spacing w:after="20" w:before="20"/>
+            </w:pPr>
+            <w:r>
+              <w:rPr>
+                <w:b w:val="0"/>
+                <w:i w:val="0"/>
+                <w:sz w:val="17"/>
+              </w:rPr>
+              <w:t>20–40</w:t>
+            </w:r>
+          </w:p>
+        </w:tc>
+        <w:tc>
+          <w:tcPr>
+            <w:tcW w:type="dxa" w:w="1417"/>
+            <w:shd w:val="clear" w:color="auto" w:fill="EEF2F8"/>
+            <w:vAlign w:val="center"/>
+          </w:tcPr>
+          <w:p>
+            <w:pPr>
+              <w:spacing w:after="20" w:before="20"/>
+              <w:jc w:val="right"/>
+            </w:pPr>
+            <w:r>
+              <w:rPr>
+                <w:b w:val="0"/>
+                <w:i w:val="0"/>
+                <w:sz w:val="17"/>
+              </w:rPr>
+              <w:t>1,27</w:t>
+            </w:r>
+          </w:p>
+        </w:tc>
+      </w:tr>
+      <w:tr>
+        <w:tc>
+          <w:tcPr>
+            <w:tcW w:type="dxa" w:w="3969"/>
+            <w:vAlign w:val="center"/>
+          </w:tcPr>
+          <w:p>
+            <w:pPr>
+              <w:spacing w:after="20" w:before="20"/>
+            </w:pPr>
+            <w:r>
+              <w:rPr>
+                <w:b w:val="0"/>
+                <w:i w:val="0"/>
+                <w:sz w:val="17"/>
+              </w:rPr>
+              <w:t>2023 kırılmasına uzaklık (km)</w:t>
+            </w:r>
+          </w:p>
+        </w:tc>
+        <w:tc>
+          <w:tcPr>
+            <w:tcW w:type="dxa" w:w="2835"/>
+            <w:vAlign w:val="center"/>
+          </w:tcPr>
+          <w:p>
+            <w:pPr>
+              <w:spacing w:after="20" w:before="20"/>
+            </w:pPr>
+            <w:r>
+              <w:rPr>
+                <w:b w:val="0"/>
+                <w:i w:val="0"/>
+                <w:sz w:val="17"/>
+              </w:rPr>
+              <w:t>40–300</w:t>
+            </w:r>
+          </w:p>
+        </w:tc>
+        <w:tc>
+          <w:tcPr>
+            <w:tcW w:type="dxa" w:w="1417"/>
+            <w:vAlign w:val="center"/>
+          </w:tcPr>
+          <w:p>
+            <w:pPr>
+              <w:spacing w:after="20" w:before="20"/>
+              <w:jc w:val="right"/>
+            </w:pPr>
+            <w:r>
+              <w:rPr>
+                <w:b w:val="0"/>
+                <w:i w:val="0"/>
+                <w:sz w:val="17"/>
+              </w:rPr>
+              <w:t>0,17</w:t>
+            </w:r>
+          </w:p>
+        </w:tc>
+      </w:tr>
+      <w:tr>
+        <w:tc>
+          <w:tcPr>
+            <w:tcW w:type="dxa" w:w="3969"/>
+            <w:shd w:val="clear" w:color="auto" w:fill="EEF2F8"/>
+            <w:vAlign w:val="center"/>
+          </w:tcPr>
+          <w:p>
+            <w:pPr>
+              <w:spacing w:after="20" w:before="20"/>
+            </w:pPr>
+            <w:r>
+              <w:rPr>
+                <w:b w:val="0"/>
+                <w:i w:val="0"/>
+                <w:sz w:val="17"/>
+              </w:rPr>
+              <w:t>arazi örtüsü (ESA WorldCover)</w:t>
+            </w:r>
+          </w:p>
+        </w:tc>
+        <w:tc>
+          <w:tcPr>
+            <w:tcW w:type="dxa" w:w="2835"/>
+            <w:shd w:val="clear" w:color="auto" w:fill="EEF2F8"/>
+            <w:vAlign w:val="center"/>
+          </w:tcPr>
+          <w:p>
+            <w:pPr>
+              <w:spacing w:after="20" w:before="20"/>
+            </w:pPr>
+            <w:r>
+              <w:rPr>
+                <w:b w:val="0"/>
+                <w:i w:val="0"/>
+                <w:sz w:val="17"/>
+              </w:rPr>
+              <w:t>Ağaç</w:t>
+            </w:r>
+          </w:p>
+        </w:tc>
+        <w:tc>
+          <w:tcPr>
+            <w:tcW w:type="dxa" w:w="1417"/>
+            <w:shd w:val="clear" w:color="auto" w:fill="EEF2F8"/>
+            <w:vAlign w:val="center"/>
+          </w:tcPr>
+          <w:p>
+            <w:pPr>
+              <w:spacing w:after="20" w:before="20"/>
+              <w:jc w:val="right"/>
+            </w:pPr>
+            <w:r>
+              <w:rPr>
+                <w:b w:val="0"/>
+                <w:i w:val="0"/>
+                <w:sz w:val="17"/>
+              </w:rPr>
+              <w:t>2,38</w:t>
+            </w:r>
+          </w:p>
+        </w:tc>
+      </w:tr>
+      <w:tr>
+        <w:tc>
+          <w:tcPr>
+            <w:tcW w:type="dxa" w:w="3969"/>
+            <w:vAlign w:val="center"/>
+          </w:tcPr>
+          <w:p>
+            <w:pPr>
+              <w:spacing w:after="20" w:before="20"/>
+            </w:pPr>
+            <w:r>
+              <w:rPr>
+                <w:b w:val="0"/>
+                <w:i w:val="0"/>
+                <w:sz w:val="17"/>
+              </w:rPr>
+              <w:t>arazi örtüsü (ESA WorldCover)</w:t>
+            </w:r>
+          </w:p>
+        </w:tc>
+        <w:tc>
+          <w:tcPr>
+            <w:tcW w:type="dxa" w:w="2835"/>
+            <w:vAlign w:val="center"/>
+          </w:tcPr>
+          <w:p>
+            <w:pPr>
+              <w:spacing w:after="20" w:before="20"/>
+            </w:pPr>
+            <w:r>
+              <w:rPr>
+                <w:b w:val="0"/>
+                <w:i w:val="0"/>
+                <w:sz w:val="17"/>
+              </w:rPr>
+              <w:t>Çalılık</w:t>
+            </w:r>
+          </w:p>
+        </w:tc>
+        <w:tc>
+          <w:tcPr>
+            <w:tcW w:type="dxa" w:w="1417"/>
+            <w:vAlign w:val="center"/>
+          </w:tcPr>
+          <w:p>
+            <w:pPr>
+              <w:spacing w:after="20" w:before="20"/>
+              <w:jc w:val="right"/>
+            </w:pPr>
+            <w:r>
+              <w:rPr>
+                <w:b w:val="0"/>
+                <w:i w:val="0"/>
+                <w:sz w:val="17"/>
+              </w:rPr>
+              <w:t>3,83</w:t>
+            </w:r>
+          </w:p>
+        </w:tc>
+      </w:tr>
+      <w:tr>
+        <w:tc>
+          <w:tcPr>
+            <w:tcW w:type="dxa" w:w="3969"/>
+            <w:shd w:val="clear" w:color="auto" w:fill="EEF2F8"/>
+            <w:vAlign w:val="center"/>
+          </w:tcPr>
+          <w:p>
+            <w:pPr>
+              <w:spacing w:after="20" w:before="20"/>
+            </w:pPr>
+            <w:r>
+              <w:rPr>
+                <w:b w:val="0"/>
+                <w:i w:val="0"/>
+                <w:sz w:val="17"/>
+              </w:rPr>
+              <w:t>arazi örtüsü (ESA WorldCover)</w:t>
+            </w:r>
+          </w:p>
+        </w:tc>
+        <w:tc>
+          <w:tcPr>
+            <w:tcW w:type="dxa" w:w="2835"/>
+            <w:shd w:val="clear" w:color="auto" w:fill="EEF2F8"/>
+            <w:vAlign w:val="center"/>
+          </w:tcPr>
+          <w:p>
+            <w:pPr>
+              <w:spacing w:after="20" w:before="20"/>
+            </w:pPr>
+            <w:r>
+              <w:rPr>
+                <w:b w:val="0"/>
+                <w:i w:val="0"/>
+                <w:sz w:val="17"/>
+              </w:rPr>
+              <w:t>Çayır</w:t>
+            </w:r>
+          </w:p>
+        </w:tc>
+        <w:tc>
+          <w:tcPr>
+            <w:tcW w:type="dxa" w:w="1417"/>
+            <w:shd w:val="clear" w:color="auto" w:fill="EEF2F8"/>
+            <w:vAlign w:val="center"/>
+          </w:tcPr>
+          <w:p>
+            <w:pPr>
+              <w:spacing w:after="20" w:before="20"/>
+              <w:jc w:val="right"/>
+            </w:pPr>
+            <w:r>
+              <w:rPr>
+                <w:b w:val="0"/>
+                <w:i w:val="0"/>
+                <w:sz w:val="17"/>
+              </w:rPr>
+              <w:t>1,38</w:t>
+            </w:r>
+          </w:p>
+        </w:tc>
+      </w:tr>
+      <w:tr>
+        <w:tc>
+          <w:tcPr>
+            <w:tcW w:type="dxa" w:w="3969"/>
+            <w:vAlign w:val="center"/>
+          </w:tcPr>
+          <w:p>
+            <w:pPr>
+              <w:spacing w:after="20" w:before="20"/>
+            </w:pPr>
+            <w:r>
+              <w:rPr>
+                <w:b w:val="0"/>
+                <w:i w:val="0"/>
+                <w:sz w:val="17"/>
+              </w:rPr>
+              <w:t>arazi örtüsü (ESA WorldCover)</w:t>
+            </w:r>
+          </w:p>
+        </w:tc>
+        <w:tc>
+          <w:tcPr>
+            <w:tcW w:type="dxa" w:w="2835"/>
+            <w:vAlign w:val="center"/>
+          </w:tcPr>
+          <w:p>
+            <w:pPr>
+              <w:spacing w:after="20" w:before="20"/>
+            </w:pPr>
+            <w:r>
+              <w:rPr>
+                <w:b w:val="0"/>
+                <w:i w:val="0"/>
+                <w:sz w:val="17"/>
+              </w:rPr>
+              <w:t>Tarım</w:t>
+            </w:r>
+          </w:p>
+        </w:tc>
+        <w:tc>
+          <w:tcPr>
+            <w:tcW w:type="dxa" w:w="1417"/>
+            <w:vAlign w:val="center"/>
+          </w:tcPr>
+          <w:p>
+            <w:pPr>
+              <w:spacing w:after="20" w:before="20"/>
+              <w:jc w:val="right"/>
+            </w:pPr>
+            <w:r>
+              <w:rPr>
+                <w:b w:val="0"/>
+                <w:i w:val="0"/>
+                <w:sz w:val="17"/>
+              </w:rPr>
+              <w:t>0,03</w:t>
+            </w:r>
+          </w:p>
+        </w:tc>
+      </w:tr>
+      <w:tr>
+        <w:tc>
+          <w:tcPr>
+            <w:tcW w:type="dxa" w:w="3969"/>
+            <w:shd w:val="clear" w:color="auto" w:fill="EEF2F8"/>
+            <w:vAlign w:val="center"/>
+          </w:tcPr>
+          <w:p>
+            <w:pPr>
+              <w:spacing w:after="20" w:before="20"/>
+            </w:pPr>
+            <w:r>
+              <w:rPr>
+                <w:b w:val="0"/>
+                <w:i w:val="0"/>
+                <w:sz w:val="17"/>
+              </w:rPr>
+              <w:t>arazi örtüsü (ESA WorldCover)</w:t>
+            </w:r>
+          </w:p>
+        </w:tc>
+        <w:tc>
+          <w:tcPr>
+            <w:tcW w:type="dxa" w:w="2835"/>
+            <w:shd w:val="clear" w:color="auto" w:fill="EEF2F8"/>
+            <w:vAlign w:val="center"/>
+          </w:tcPr>
+          <w:p>
+            <w:pPr>
+              <w:spacing w:after="20" w:before="20"/>
+            </w:pPr>
+            <w:r>
+              <w:rPr>
+                <w:b w:val="0"/>
+                <w:i w:val="0"/>
+                <w:sz w:val="17"/>
+              </w:rPr>
+              <w:t>Yapılaşma</w:t>
+            </w:r>
+          </w:p>
+        </w:tc>
+        <w:tc>
+          <w:tcPr>
+            <w:tcW w:type="dxa" w:w="1417"/>
+            <w:shd w:val="clear" w:color="auto" w:fill="EEF2F8"/>
+            <w:vAlign w:val="center"/>
+          </w:tcPr>
+          <w:p>
+            <w:pPr>
+              <w:spacing w:after="20" w:before="20"/>
+              <w:jc w:val="right"/>
+            </w:pPr>
+            <w:r>
+              <w:rPr>
+                <w:b w:val="0"/>
+                <w:i w:val="0"/>
+                <w:sz w:val="17"/>
+              </w:rPr>
+              <w:t>0,13</w:t>
+            </w:r>
+          </w:p>
+        </w:tc>
+      </w:tr>
+      <w:tr>
+        <w:tc>
+          <w:tcPr>
+            <w:tcW w:type="dxa" w:w="3969"/>
+            <w:vAlign w:val="center"/>
+          </w:tcPr>
+          <w:p>
+            <w:pPr>
+              <w:spacing w:after="20" w:before="20"/>
+            </w:pPr>
+            <w:r>
+              <w:rPr>
+                <w:b w:val="0"/>
+                <w:i w:val="0"/>
+                <w:sz w:val="17"/>
+              </w:rPr>
+              <w:t>arazi örtüsü (ESA WorldCover)</w:t>
+            </w:r>
+          </w:p>
+        </w:tc>
+        <w:tc>
+          <w:tcPr>
+            <w:tcW w:type="dxa" w:w="2835"/>
+            <w:vAlign w:val="center"/>
+          </w:tcPr>
+          <w:p>
+            <w:pPr>
+              <w:spacing w:after="20" w:before="20"/>
+            </w:pPr>
+            <w:r>
+              <w:rPr>
+                <w:b w:val="0"/>
+                <w:i w:val="0"/>
+                <w:sz w:val="17"/>
+              </w:rPr>
+              <w:t>Çıplak/seyrek</w:t>
+            </w:r>
+          </w:p>
+        </w:tc>
+        <w:tc>
+          <w:tcPr>
+            <w:tcW w:type="dxa" w:w="1417"/>
+            <w:vAlign w:val="center"/>
+          </w:tcPr>
+          <w:p>
+            <w:pPr>
+              <w:spacing w:after="20" w:before="20"/>
+              <w:jc w:val="right"/>
+            </w:pPr>
+            <w:r>
+              <w:rPr>
+                <w:b w:val="0"/>
+                <w:i w:val="0"/>
+                <w:sz w:val="17"/>
+              </w:rPr>
+              <w:t>2,23</w:t>
+            </w:r>
+          </w:p>
+        </w:tc>
+      </w:tr>
+      <w:tr>
+        <w:tc>
+          <w:tcPr>
+            <w:tcW w:type="dxa" w:w="3969"/>
+            <w:shd w:val="clear" w:color="auto" w:fill="EEF2F8"/>
+            <w:vAlign w:val="center"/>
+          </w:tcPr>
+          <w:p>
+            <w:pPr>
+              <w:spacing w:after="20" w:before="20"/>
+            </w:pPr>
+            <w:r>
+              <w:rPr>
+                <w:b w:val="0"/>
+                <w:i w:val="0"/>
+                <w:sz w:val="17"/>
+              </w:rPr>
+              <w:t>arazi örtüsü (ESA WorldCover)</w:t>
+            </w:r>
+          </w:p>
+        </w:tc>
+        <w:tc>
+          <w:tcPr>
+            <w:tcW w:type="dxa" w:w="2835"/>
+            <w:shd w:val="clear" w:color="auto" w:fill="EEF2F8"/>
+            <w:vAlign w:val="center"/>
+          </w:tcPr>
+          <w:p>
+            <w:pPr>
+              <w:spacing w:after="20" w:before="20"/>
+            </w:pPr>
+            <w:r>
+              <w:rPr>
+                <w:b w:val="0"/>
+                <w:i w:val="0"/>
+                <w:sz w:val="17"/>
+              </w:rPr>
+              <w:t>Su</w:t>
+            </w:r>
+          </w:p>
+        </w:tc>
+        <w:tc>
+          <w:tcPr>
+            <w:tcW w:type="dxa" w:w="1417"/>
+            <w:shd w:val="clear" w:color="auto" w:fill="EEF2F8"/>
+            <w:vAlign w:val="center"/>
+          </w:tcPr>
+          <w:p>
+            <w:pPr>
+              <w:spacing w:after="20" w:before="20"/>
+              <w:jc w:val="right"/>
+            </w:pPr>
+            <w:r>
+              <w:rPr>
+                <w:b w:val="0"/>
+                <w:i w:val="0"/>
+                <w:sz w:val="17"/>
+              </w:rPr>
+              <w:t>0,19</w:t>
+            </w:r>
+          </w:p>
+        </w:tc>
+      </w:tr>
+      <w:tr>
+        <w:tc>
+          <w:tcPr>
+            <w:tcW w:type="dxa" w:w="3969"/>
+            <w:vAlign w:val="center"/>
+          </w:tcPr>
+          <w:p>
+            <w:pPr>
+              <w:spacing w:after="20" w:before="20"/>
+            </w:pPr>
+            <w:r>
+              <w:rPr>
+                <w:b w:val="0"/>
+                <w:i w:val="0"/>
+                <w:sz w:val="17"/>
+              </w:rPr>
+              <w:t>arazi örtüsü (ESA WorldCover)</w:t>
+            </w:r>
+          </w:p>
+        </w:tc>
+        <w:tc>
+          <w:tcPr>
+            <w:tcW w:type="dxa" w:w="2835"/>
+            <w:vAlign w:val="center"/>
+          </w:tcPr>
+          <w:p>
+            <w:pPr>
+              <w:spacing w:after="20" w:before="20"/>
+            </w:pPr>
+            <w:r>
+              <w:rPr>
+                <w:b w:val="0"/>
+                <w:i w:val="0"/>
+                <w:sz w:val="17"/>
+              </w:rPr>
+              <w:t>Sulak alan</w:t>
+            </w:r>
+          </w:p>
+        </w:tc>
+        <w:tc>
+          <w:tcPr>
+            <w:tcW w:type="dxa" w:w="1417"/>
+            <w:vAlign w:val="center"/>
+          </w:tcPr>
+          <w:p>
+            <w:pPr>
+              <w:spacing w:after="20" w:before="20"/>
+              <w:jc w:val="right"/>
+            </w:pPr>
+            <w:r>
+              <w:rPr>
+                <w:b w:val="0"/>
+                <w:i w:val="0"/>
+                <w:sz w:val="17"/>
+              </w:rPr>
+              <w:t>0,00</w:t>
+            </w:r>
+          </w:p>
+        </w:tc>
+      </w:tr>
+    </w:tbl>
+    <w:p>
+      <w:pPr>
+        <w:spacing w:after="40"/>
+      </w:pPr>
+    </w:p>
+    <w:p>
+      <w:pPr>
+        <w:keepNext/>
+        <w:jc w:val="center"/>
+      </w:pPr>
+      <w:r>
+        <w:drawing>
+          <wp:inline xmlns:a="http://schemas.openxmlformats.org/drawingml/2006/main" xmlns:pic="http://schemas.openxmlformats.org/drawingml/2006/picture">
+            <wp:extent cx="5760000" cy="3264000"/>
+            <wp:docPr id="9" name="Picture 9"/>
+            <wp:cNvGraphicFramePr>
+              <a:graphicFrameLocks noChangeAspect="1"/>
+            </wp:cNvGraphicFramePr>
+            <a:graphic>
+              <a:graphicData uri="http://schemas.openxmlformats.org/drawingml/2006/picture">
+                <pic:pic>
+                  <pic:nvPicPr>
+                    <pic:cNvPr id="0" name="frequency_ratio.png"/>
+                    <pic:cNvPicPr/>
+                  </pic:nvPicPr>
+                  <pic:blipFill>
+                    <a:blip r:embed="rId17"/>
+                    <a:stretch>
+                      <a:fillRect/>
+                    </a:stretch>
+                  </pic:blipFill>
+                  <pic:spPr>
+                    <a:xfrm>
+                      <a:off x="0" y="0"/>
+                      <a:ext cx="5760000" cy="3264000"/>
+                    </a:xfrm>
+                    <a:prstGeom prst="rect"/>
+                  </pic:spPr>
+                </pic:pic>
+              </a:graphicData>
+            </a:graphic>
+          </wp:inline>
+        </w:drawing>
+      </w:r>
+    </w:p>
+    <w:p>
+      <w:pPr>
+        <w:spacing w:after="200"/>
+        <w:jc w:val="center"/>
+      </w:pPr>
+      <w:r>
+        <w:rPr>
+          <w:b w:val="0"/>
+          <w:i/>
+          <w:color w:val="595959"/>
+          <w:sz w:val="19"/>
+        </w:rPr>
+        <w:t>Şekil 9. Frekans Oranı (kırmızı: FR &gt; 1, heyelana yatkın).</w:t>
+      </w:r>
+    </w:p>
+    <w:p>
+      <w:r>
+        <w:rPr>
+          <w:b/>
+          <w:i w:val="0"/>
+        </w:rPr>
+        <w:t>“Heyelan yok” etiketinin kirliliği.</w:t>
+      </w:r>
+      <w:r>
+        <w:rPr>
+          <w:b w:val="0"/>
+          <w:i w:val="0"/>
+        </w:rPr>
+        <w:t xml:space="preserve"> Envanter kar ve gölge nedeniyle eksik olabilir; bu durumda “heyelan yok” noktalarının bir kısmı aslında haritalanmamış heyelandır. Negatif noktaların heyelanlara medyan uzaklığı 24,36 km; yalnızca %2.1’i 1 km’den yakın. Dört eğitim varyantı aynı test bölgelerinde karşılaştırıldı:</w:t>
+      </w:r>
+    </w:p>
+    <w:tbl>
+      <w:tblPr>
+        <w:tblStyle w:val="TableGrid"/>
+        <w:tblW w:type="auto" w:w="0"/>
+        <w:jc w:val="center"/>
+        <w:tblLayout w:type="fixed"/>
+        <w:tblLook w:firstColumn="1" w:firstRow="1" w:lastColumn="0" w:lastRow="0" w:noHBand="0" w:noVBand="1" w:val="04A0"/>
+        <w:tblBorders>
+          <w:top w:val="single" w:sz="4" w:color="C9CED6"/>
+          <w:left w:val="single" w:sz="4" w:color="C9CED6"/>
+          <w:bottom w:val="single" w:sz="4" w:color="C9CED6"/>
+          <w:right w:val="single" w:sz="4" w:color="C9CED6"/>
+          <w:insideH w:val="single" w:sz="4" w:color="C9CED6"/>
+          <w:insideV w:val="single" w:sz="4" w:color="C9CED6"/>
+        </w:tblBorders>
+      </w:tblPr>
+      <w:tblGrid>
+        <w:gridCol w:w="1900"/>
+        <w:gridCol w:w="1900"/>
+        <w:gridCol w:w="1900"/>
+        <w:gridCol w:w="1900"/>
+        <w:gridCol w:w="1900"/>
+      </w:tblGrid>
+      <w:tr>
+        <w:tc>
+          <w:tcPr>
+            <w:tcW w:type="dxa" w:w="3175"/>
+            <w:shd w:val="clear" w:color="auto" w:fill="1F3864"/>
+            <w:vAlign w:val="center"/>
+          </w:tcPr>
+          <w:p>
+            <w:pPr>
+              <w:spacing w:after="20" w:before="20"/>
+            </w:pPr>
+            <w:r/>
+            <w:r>
+              <w:rPr>
+                <w:b/>
+                <w:color w:val="FFFFFF"/>
+                <w:sz w:val="17"/>
+              </w:rPr>
+              <w:t>Eğitim varyantı</w:t>
+            </w:r>
+          </w:p>
+        </w:tc>
+        <w:tc>
+          <w:tcPr>
+            <w:tcW w:type="dxa" w:w="1644"/>
+            <w:shd w:val="clear" w:color="auto" w:fill="1F3864"/>
+            <w:vAlign w:val="center"/>
+          </w:tcPr>
+          <w:p>
+            <w:pPr>
+              <w:spacing w:after="20" w:before="20"/>
+              <w:jc w:val="right"/>
+            </w:pPr>
+            <w:r/>
+            <w:r>
+              <w:rPr>
+                <w:b/>
+                <w:color w:val="FFFFFF"/>
+                <w:sz w:val="17"/>
+              </w:rPr>
+              <w:t>ROC-AUC</w:t>
+            </w:r>
+          </w:p>
+        </w:tc>
+        <w:tc>
+          <w:tcPr>
+            <w:tcW w:type="dxa" w:w="1191"/>
+            <w:shd w:val="clear" w:color="auto" w:fill="1F3864"/>
+            <w:vAlign w:val="center"/>
+          </w:tcPr>
+          <w:p>
+            <w:pPr>
+              <w:spacing w:after="20" w:before="20"/>
+              <w:jc w:val="right"/>
+            </w:pPr>
+            <w:r/>
+            <w:r>
+              <w:rPr>
+                <w:b/>
+                <w:color w:val="FFFFFF"/>
+                <w:sz w:val="17"/>
+              </w:rPr>
+              <w:t>Dik arazi</w:t>
+            </w:r>
+          </w:p>
+        </w:tc>
+        <w:tc>
+          <w:tcPr>
+            <w:tcW w:type="dxa" w:w="1814"/>
+            <w:shd w:val="clear" w:color="auto" w:fill="1F3864"/>
+            <w:vAlign w:val="center"/>
+          </w:tcPr>
+          <w:p>
+            <w:pPr>
+              <w:spacing w:after="20" w:before="20"/>
+              <w:jc w:val="right"/>
+            </w:pPr>
+            <w:r/>
+            <w:r>
+              <w:rPr>
+                <w:b/>
+                <w:color w:val="FFFFFF"/>
+                <w:sz w:val="17"/>
+              </w:rPr>
+              <w:t>Kritik PGA (P=0,5)</w:t>
+            </w:r>
+          </w:p>
+        </w:tc>
+        <w:tc>
+          <w:tcPr>
+            <w:tcW w:type="dxa" w:w="1644"/>
+            <w:shd w:val="clear" w:color="auto" w:fill="1F3864"/>
+            <w:vAlign w:val="center"/>
+          </w:tcPr>
+          <w:p>
+            <w:pPr>
+              <w:spacing w:after="20" w:before="20"/>
+              <w:jc w:val="right"/>
+            </w:pPr>
+            <w:r/>
+            <w:r>
+              <w:rPr>
+                <w:b/>
+                <w:color w:val="FFFFFF"/>
+                <w:sz w:val="17"/>
+              </w:rPr>
+              <w:t>Başlangıç (LR=1)</w:t>
+            </w:r>
+          </w:p>
+        </w:tc>
+      </w:tr>
+      <w:tr>
+        <w:tc>
+          <w:tcPr>
+            <w:tcW w:type="dxa" w:w="3175"/>
+            <w:vAlign w:val="center"/>
+          </w:tcPr>
+          <w:p>
+            <w:pPr>
+              <w:spacing w:after="20" w:before="20"/>
+            </w:pPr>
+            <w:r>
+              <w:rPr>
+                <w:b w:val="0"/>
+                <w:i w:val="0"/>
+                <w:sz w:val="17"/>
+              </w:rPr>
+              <w:t>Temel (≥ 200 m)</w:t>
+            </w:r>
+          </w:p>
+        </w:tc>
+        <w:tc>
+          <w:tcPr>
+            <w:tcW w:type="dxa" w:w="1644"/>
+            <w:vAlign w:val="center"/>
+          </w:tcPr>
+          <w:p>
+            <w:pPr>
+              <w:spacing w:after="20" w:before="20"/>
+              <w:jc w:val="right"/>
+            </w:pPr>
+            <w:r>
+              <w:rPr>
+                <w:b w:val="0"/>
+                <w:i w:val="0"/>
+                <w:sz w:val="17"/>
+              </w:rPr>
+              <w:t>0,965 ± 0,014</w:t>
+            </w:r>
+          </w:p>
+        </w:tc>
+        <w:tc>
+          <w:tcPr>
+            <w:tcW w:type="dxa" w:w="1191"/>
+            <w:vAlign w:val="center"/>
+          </w:tcPr>
+          <w:p>
+            <w:pPr>
+              <w:spacing w:after="20" w:before="20"/>
+              <w:jc w:val="right"/>
+            </w:pPr>
+            <w:r>
+              <w:rPr>
+                <w:b w:val="0"/>
+                <w:i w:val="0"/>
+                <w:sz w:val="17"/>
+              </w:rPr>
+              <w:t>0,906</w:t>
+            </w:r>
+          </w:p>
+        </w:tc>
+        <w:tc>
+          <w:tcPr>
+            <w:tcW w:type="dxa" w:w="1814"/>
+            <w:vAlign w:val="center"/>
+          </w:tcPr>
+          <w:p>
+            <w:pPr>
+              <w:spacing w:after="20" w:before="20"/>
+              <w:jc w:val="right"/>
+            </w:pPr>
+            <w:r>
+              <w:rPr>
+                <w:b w:val="0"/>
+                <w:i w:val="0"/>
+                <w:sz w:val="17"/>
+              </w:rPr>
+              <w:t>0,57 ± 0,07 g</w:t>
+            </w:r>
+          </w:p>
+        </w:tc>
+        <w:tc>
+          <w:tcPr>
+            <w:tcW w:type="dxa" w:w="1644"/>
+            <w:vAlign w:val="center"/>
+          </w:tcPr>
+          <w:p>
+            <w:pPr>
+              <w:spacing w:after="20" w:before="20"/>
+              <w:jc w:val="right"/>
+            </w:pPr>
+            <w:r>
+              <w:rPr>
+                <w:b w:val="0"/>
+                <w:i w:val="0"/>
+                <w:sz w:val="17"/>
+              </w:rPr>
+              <w:t>0,06 ± 0,03 g</w:t>
+            </w:r>
+          </w:p>
+        </w:tc>
+      </w:tr>
+      <w:tr>
+        <w:tc>
+          <w:tcPr>
+            <w:tcW w:type="dxa" w:w="3175"/>
+            <w:shd w:val="clear" w:color="auto" w:fill="EEF2F8"/>
+            <w:vAlign w:val="center"/>
+          </w:tcPr>
+          <w:p>
+            <w:pPr>
+              <w:spacing w:after="20" w:before="20"/>
+            </w:pPr>
+            <w:r>
+              <w:rPr>
+                <w:b w:val="0"/>
+                <w:i w:val="0"/>
+                <w:sz w:val="17"/>
+              </w:rPr>
+              <w:t>Negatifler ≥ 1 km</w:t>
+            </w:r>
+          </w:p>
+        </w:tc>
+        <w:tc>
+          <w:tcPr>
+            <w:tcW w:type="dxa" w:w="1644"/>
+            <w:shd w:val="clear" w:color="auto" w:fill="EEF2F8"/>
+            <w:vAlign w:val="center"/>
+          </w:tcPr>
+          <w:p>
+            <w:pPr>
+              <w:spacing w:after="20" w:before="20"/>
+              <w:jc w:val="right"/>
+            </w:pPr>
+            <w:r>
+              <w:rPr>
+                <w:b w:val="0"/>
+                <w:i w:val="0"/>
+                <w:sz w:val="17"/>
+              </w:rPr>
+              <w:t>0,965 ± 0,013</w:t>
+            </w:r>
+          </w:p>
+        </w:tc>
+        <w:tc>
+          <w:tcPr>
+            <w:tcW w:type="dxa" w:w="1191"/>
+            <w:shd w:val="clear" w:color="auto" w:fill="EEF2F8"/>
+            <w:vAlign w:val="center"/>
+          </w:tcPr>
+          <w:p>
+            <w:pPr>
+              <w:spacing w:after="20" w:before="20"/>
+              <w:jc w:val="right"/>
+            </w:pPr>
+            <w:r>
+              <w:rPr>
+                <w:b w:val="0"/>
+                <w:i w:val="0"/>
+                <w:sz w:val="17"/>
+              </w:rPr>
+              <w:t>0,908</w:t>
+            </w:r>
+          </w:p>
+        </w:tc>
+        <w:tc>
+          <w:tcPr>
+            <w:tcW w:type="dxa" w:w="1814"/>
+            <w:shd w:val="clear" w:color="auto" w:fill="EEF2F8"/>
+            <w:vAlign w:val="center"/>
+          </w:tcPr>
+          <w:p>
+            <w:pPr>
+              <w:spacing w:after="20" w:before="20"/>
+              <w:jc w:val="right"/>
+            </w:pPr>
+            <w:r>
+              <w:rPr>
+                <w:b w:val="0"/>
+                <w:i w:val="0"/>
+                <w:sz w:val="17"/>
+              </w:rPr>
+              <w:t>0,52 ± 0,06 g</w:t>
+            </w:r>
+          </w:p>
+        </w:tc>
+        <w:tc>
+          <w:tcPr>
+            <w:tcW w:type="dxa" w:w="1644"/>
+            <w:shd w:val="clear" w:color="auto" w:fill="EEF2F8"/>
+            <w:vAlign w:val="center"/>
+          </w:tcPr>
+          <w:p>
+            <w:pPr>
+              <w:spacing w:after="20" w:before="20"/>
+              <w:jc w:val="right"/>
+            </w:pPr>
+            <w:r>
+              <w:rPr>
+                <w:b w:val="0"/>
+                <w:i w:val="0"/>
+                <w:sz w:val="17"/>
+              </w:rPr>
+              <w:t>0,06 ± 0,02 g</w:t>
+            </w:r>
+          </w:p>
+        </w:tc>
+      </w:tr>
+      <w:tr>
+        <w:tc>
+          <w:tcPr>
+            <w:tcW w:type="dxa" w:w="3175"/>
+            <w:vAlign w:val="center"/>
+          </w:tcPr>
+          <w:p>
+            <w:pPr>
+              <w:spacing w:after="20" w:before="20"/>
+            </w:pPr>
+            <w:r>
+              <w:rPr>
+                <w:b w:val="0"/>
+                <w:i w:val="0"/>
+                <w:sz w:val="17"/>
+              </w:rPr>
+              <w:t>Negatifler ≥ 2 km</w:t>
+            </w:r>
+          </w:p>
+        </w:tc>
+        <w:tc>
+          <w:tcPr>
+            <w:tcW w:type="dxa" w:w="1644"/>
+            <w:vAlign w:val="center"/>
+          </w:tcPr>
+          <w:p>
+            <w:pPr>
+              <w:spacing w:after="20" w:before="20"/>
+              <w:jc w:val="right"/>
+            </w:pPr>
+            <w:r>
+              <w:rPr>
+                <w:b w:val="0"/>
+                <w:i w:val="0"/>
+                <w:sz w:val="17"/>
+              </w:rPr>
+              <w:t>0,965 ± 0,014</w:t>
+            </w:r>
+          </w:p>
+        </w:tc>
+        <w:tc>
+          <w:tcPr>
+            <w:tcW w:type="dxa" w:w="1191"/>
+            <w:vAlign w:val="center"/>
+          </w:tcPr>
+          <w:p>
+            <w:pPr>
+              <w:spacing w:after="20" w:before="20"/>
+              <w:jc w:val="right"/>
+            </w:pPr>
+            <w:r>
+              <w:rPr>
+                <w:b w:val="0"/>
+                <w:i w:val="0"/>
+                <w:sz w:val="17"/>
+              </w:rPr>
+              <w:t>0,907</w:t>
+            </w:r>
+          </w:p>
+        </w:tc>
+        <w:tc>
+          <w:tcPr>
+            <w:tcW w:type="dxa" w:w="1814"/>
+            <w:vAlign w:val="center"/>
+          </w:tcPr>
+          <w:p>
+            <w:pPr>
+              <w:spacing w:after="20" w:before="20"/>
+              <w:jc w:val="right"/>
+            </w:pPr>
+            <w:r>
+              <w:rPr>
+                <w:b w:val="0"/>
+                <w:i w:val="0"/>
+                <w:sz w:val="17"/>
+              </w:rPr>
+              <w:t>0,46 ± 0,05 g</w:t>
+            </w:r>
+          </w:p>
+        </w:tc>
+        <w:tc>
+          <w:tcPr>
+            <w:tcW w:type="dxa" w:w="1644"/>
+            <w:vAlign w:val="center"/>
+          </w:tcPr>
+          <w:p>
+            <w:pPr>
+              <w:spacing w:after="20" w:before="20"/>
+              <w:jc w:val="right"/>
+            </w:pPr>
+            <w:r>
+              <w:rPr>
+                <w:b w:val="0"/>
+                <w:i w:val="0"/>
+                <w:sz w:val="17"/>
+              </w:rPr>
+              <w:t>0,09 ± 0,02 g</w:t>
+            </w:r>
+          </w:p>
+        </w:tc>
+      </w:tr>
+      <w:tr>
+        <w:tc>
+          <w:tcPr>
+            <w:tcW w:type="dxa" w:w="3175"/>
+            <w:shd w:val="clear" w:color="auto" w:fill="EEF2F8"/>
+            <w:vAlign w:val="center"/>
+          </w:tcPr>
+          <w:p>
+            <w:pPr>
+              <w:spacing w:after="20" w:before="20"/>
+            </w:pPr>
+            <w:r>
+              <w:rPr>
+                <w:b w:val="0"/>
+                <w:i w:val="0"/>
+                <w:sz w:val="17"/>
+              </w:rPr>
+              <w:t>PU-casus (%5 şüpheli negatif çıkarıldı)</w:t>
+            </w:r>
+          </w:p>
+        </w:tc>
+        <w:tc>
+          <w:tcPr>
+            <w:tcW w:type="dxa" w:w="1644"/>
+            <w:shd w:val="clear" w:color="auto" w:fill="EEF2F8"/>
+            <w:vAlign w:val="center"/>
+          </w:tcPr>
+          <w:p>
+            <w:pPr>
+              <w:spacing w:after="20" w:before="20"/>
+              <w:jc w:val="right"/>
+            </w:pPr>
+            <w:r>
+              <w:rPr>
+                <w:b w:val="0"/>
+                <w:i w:val="0"/>
+                <w:sz w:val="17"/>
+              </w:rPr>
+              <w:t>0,967 ± 0,011</w:t>
+            </w:r>
+          </w:p>
+        </w:tc>
+        <w:tc>
+          <w:tcPr>
+            <w:tcW w:type="dxa" w:w="1191"/>
+            <w:shd w:val="clear" w:color="auto" w:fill="EEF2F8"/>
+            <w:vAlign w:val="center"/>
+          </w:tcPr>
+          <w:p>
+            <w:pPr>
+              <w:spacing w:after="20" w:before="20"/>
+              <w:jc w:val="right"/>
+            </w:pPr>
+            <w:r>
+              <w:rPr>
+                <w:b w:val="0"/>
+                <w:i w:val="0"/>
+                <w:sz w:val="17"/>
+              </w:rPr>
+              <w:t>0,915</w:t>
+            </w:r>
+          </w:p>
+        </w:tc>
+        <w:tc>
+          <w:tcPr>
+            <w:tcW w:type="dxa" w:w="1814"/>
+            <w:shd w:val="clear" w:color="auto" w:fill="EEF2F8"/>
+            <w:vAlign w:val="center"/>
+          </w:tcPr>
+          <w:p>
+            <w:pPr>
+              <w:spacing w:after="20" w:before="20"/>
+              <w:jc w:val="right"/>
+            </w:pPr>
+            <w:r>
+              <w:rPr>
+                <w:b w:val="0"/>
+                <w:i w:val="0"/>
+                <w:sz w:val="17"/>
+              </w:rPr>
+              <w:t>0,35 ± 0,03 g</w:t>
+            </w:r>
+          </w:p>
+        </w:tc>
+        <w:tc>
+          <w:tcPr>
+            <w:tcW w:type="dxa" w:w="1644"/>
+            <w:shd w:val="clear" w:color="auto" w:fill="EEF2F8"/>
+            <w:vAlign w:val="center"/>
+          </w:tcPr>
+          <w:p>
+            <w:pPr>
+              <w:spacing w:after="20" w:before="20"/>
+              <w:jc w:val="right"/>
+            </w:pPr>
+            <w:r>
+              <w:rPr>
+                <w:b w:val="0"/>
+                <w:i w:val="0"/>
+                <w:sz w:val="17"/>
+              </w:rPr>
+              <w:t>0,04 ± 0,03 g</w:t>
+            </w:r>
+          </w:p>
+        </w:tc>
+      </w:tr>
+    </w:tbl>
+    <w:p>
+      <w:pPr>
+        <w:spacing w:after="40"/>
+      </w:pPr>
+    </w:p>
+    <w:p>
+      <w:r>
+        <w:rPr>
+          <w:b/>
+          <w:i w:val="0"/>
+        </w:rPr>
+        <w:t>Uydu doğrulaması.</w:t>
+      </w:r>
+      <w:r>
+        <w:rPr>
+          <w:b w:val="0"/>
+          <w:i w:val="0"/>
+        </w:rPr>
+        <w:t xml:space="preserve"> Her poligonda 2022 yazı → 2023 yazı Sentinel-2 bitki örtüsü (NDVI) ve parlaklık değişimi, çevresindeki halkaya göre ölçülecek şekilde hazırlandı (Google Earth Engine betiği gee/ndvi_change.js). Sinyal vermeyen poligonlar eğitimden çıkarılarak duyarlılık yeniden raporlanacak.</w:t>
+      </w:r>
+    </w:p>
+    <w:p>
+      <w:pPr>
         <w:pStyle w:val="Heading1"/>
       </w:pPr>
       <w:r>
@@ -7109,7 +9674,7 @@
       </w:r>
     </w:p>
     <w:sectPr>
-      <w:footerReference w:type="default" r:id="rId17"/>
+      <w:footerReference w:type="default" r:id="rId18"/>
       <w:pgSz w:w="11906" w:h="16838"/>
       <w:pgMar w:top="1202" w:right="1202" w:bottom="1202" w:left="1202" w:header="720" w:footer="720" w:gutter="0"/>
       <w:cols w:space="720"/>

</xml_diff>